<commit_message>
quick fix: add by id
</commit_message>
<xml_diff>
--- a/minimal.docx
+++ b/minimal.docx
@@ -359,16 +359,50 @@
           <w:kern w:val="0"/>
           <w:lang w:val="en-GB"/>
         </w:rPr>
-        <w:t xml:space="preserve">[0] </w:t>
-      </w:r>
-      <w:proofErr w:type="gramStart"/>
-      <w:r>
-        <w:rPr>
-          <w:rFonts w:ascii="Helvetica" w:hAnsi="Helvetica" w:cs="Helvetica"/>
-          <w:kern w:val="0"/>
-          <w:lang w:val="en-GB"/>
-        </w:rPr>
-        <w:t>predicates[0]=</w:t>
+        <w:t>[0</w:t>
+      </w:r>
+      <w:proofErr w:type="gramStart"/>
+      <w:r>
+        <w:rPr>
+          <w:rFonts w:ascii="Helvetica" w:hAnsi="Helvetica" w:cs="Helvetica"/>
+          <w:kern w:val="0"/>
+          <w:lang w:val="en-GB"/>
+        </w:rPr>
+        <w:t>]</w:t>
+      </w:r>
+      <w:r>
+        <w:rPr>
+          <w:rFonts w:ascii="Helvetica" w:hAnsi="Helvetica" w:cs="Helvetica"/>
+          <w:kern w:val="0"/>
+          <w:lang w:val="en-GB"/>
+        </w:rPr>
+        <w:t>.</w:t>
+      </w:r>
+      <w:r>
+        <w:rPr>
+          <w:rFonts w:ascii="Helvetica" w:hAnsi="Helvetica" w:cs="Helvetica"/>
+          <w:kern w:val="0"/>
+          <w:lang w:val="en-GB"/>
+        </w:rPr>
+        <w:t>predicates</w:t>
+      </w:r>
+      <w:proofErr w:type="gramEnd"/>
+      <w:r>
+        <w:rPr>
+          <w:rFonts w:ascii="Helvetica" w:hAnsi="Helvetica" w:cs="Helvetica"/>
+          <w:kern w:val="0"/>
+          <w:lang w:val="en-GB"/>
+        </w:rPr>
+        <w:t>[</w:t>
+      </w:r>
+      <w:proofErr w:type="gramStart"/>
+      <w:r>
+        <w:rPr>
+          <w:rFonts w:ascii="Helvetica" w:hAnsi="Helvetica" w:cs="Helvetica"/>
+          <w:kern w:val="0"/>
+          <w:lang w:val="en-GB"/>
+        </w:rPr>
+        <w:t>0]=</w:t>
       </w:r>
       <w:proofErr w:type="gramEnd"/>
       <w:r>
@@ -553,7 +587,6 @@
           <w:lang w:val="en-US"/>
         </w:rPr>
       </w:pPr>
-      <w:proofErr w:type="spellStart"/>
       <w:proofErr w:type="gramStart"/>
       <w:r>
         <w:rPr>
@@ -615,24 +648,41 @@
         </w:rPr>
         <w:t>webflux.routes</w:t>
       </w:r>
-      <w:proofErr w:type="spellEnd"/>
-      <w:proofErr w:type="gramEnd"/>
-      <w:r>
-        <w:rPr>
-          <w:rFonts w:ascii="Helvetica" w:hAnsi="Helvetica" w:cs="Helvetica"/>
-          <w:kern w:val="0"/>
-          <w:lang w:val="en-GB"/>
-        </w:rPr>
-        <w:t xml:space="preserve">[1] </w:t>
-      </w:r>
-      <w:proofErr w:type="gramStart"/>
-      <w:r>
-        <w:rPr>
-          <w:rFonts w:ascii="Helvetica" w:hAnsi="Helvetica" w:cs="Helvetica"/>
-          <w:kern w:val="0"/>
-          <w:lang w:val="en-GB"/>
-        </w:rPr>
-        <w:t>predicates[0]=</w:t>
+      <w:proofErr w:type="gramEnd"/>
+      <w:r>
+        <w:rPr>
+          <w:rFonts w:ascii="Helvetica" w:hAnsi="Helvetica" w:cs="Helvetica"/>
+          <w:kern w:val="0"/>
+          <w:lang w:val="en-GB"/>
+        </w:rPr>
+        <w:t>[</w:t>
+      </w:r>
+      <w:proofErr w:type="gramStart"/>
+      <w:r>
+        <w:rPr>
+          <w:rFonts w:ascii="Helvetica" w:hAnsi="Helvetica" w:cs="Helvetica"/>
+          <w:kern w:val="0"/>
+          <w:lang w:val="en-GB"/>
+        </w:rPr>
+        <w:t>1]predicates</w:t>
+      </w:r>
+      <w:proofErr w:type="gramEnd"/>
+      <w:r>
+        <w:rPr>
+          <w:rFonts w:ascii="Helvetica" w:hAnsi="Helvetica" w:cs="Helvetica"/>
+          <w:kern w:val="0"/>
+          <w:lang w:val="en-GB"/>
+        </w:rPr>
+        <w:t>[</w:t>
+      </w:r>
+      <w:proofErr w:type="gramStart"/>
+      <w:r>
+        <w:rPr>
+          <w:rFonts w:ascii="Helvetica" w:hAnsi="Helvetica" w:cs="Helvetica"/>
+          <w:kern w:val="0"/>
+          <w:lang w:val="en-GB"/>
+        </w:rPr>
+        <w:t>0]=</w:t>
       </w:r>
       <w:proofErr w:type="gramEnd"/>
       <w:r>
@@ -3879,6 +3929,1310 @@
         </w:rPr>
         <w:t>ENTRYPOINT ["java", "-jar", "app.jar"]</w:t>
       </w:r>
+    </w:p>
+    <w:p>
+      <w:pPr>
+        <w:rPr>
+          <w:lang w:val="en-US"/>
+        </w:rPr>
+      </w:pPr>
+    </w:p>
+    <w:p>
+      <w:pPr>
+        <w:rPr>
+          <w:u w:val="single"/>
+          <w:lang w:val="en-US"/>
+        </w:rPr>
+      </w:pPr>
+      <w:r>
+        <w:rPr>
+          <w:u w:val="single"/>
+          <w:lang w:val="en-US"/>
+        </w:rPr>
+        <w:t>Get By id</w:t>
+      </w:r>
+    </w:p>
+    <w:p>
+      <w:pPr>
+        <w:pStyle w:val="HTMLPreformatted"/>
+        <w:rPr>
+          <w:rFonts w:asciiTheme="minorHAnsi" w:eastAsiaTheme="minorHAnsi" w:hAnsiTheme="minorHAnsi" w:cstheme="minorBidi"/>
+          <w:kern w:val="2"/>
+          <w:sz w:val="24"/>
+          <w:szCs w:val="24"/>
+          <w:lang w:val="en-IN"/>
+          <w14:ligatures w14:val="standardContextual"/>
+        </w:rPr>
+      </w:pPr>
+      <w:r>
+        <w:rPr>
+          <w:rFonts w:asciiTheme="minorHAnsi" w:eastAsiaTheme="minorHAnsi" w:hAnsiTheme="minorHAnsi" w:cstheme="minorBidi"/>
+          <w:kern w:val="2"/>
+          <w:sz w:val="24"/>
+          <w:szCs w:val="24"/>
+          <w:lang w:val="en-IN"/>
+          <w14:ligatures w14:val="standardContextual"/>
+        </w:rPr>
+        <w:t xml:space="preserve">package </w:t>
+      </w:r>
+      <w:proofErr w:type="spellStart"/>
+      <w:proofErr w:type="gramStart"/>
+      <w:r>
+        <w:rPr>
+          <w:rFonts w:asciiTheme="minorHAnsi" w:eastAsiaTheme="minorHAnsi" w:hAnsiTheme="minorHAnsi" w:cstheme="minorBidi"/>
+          <w:kern w:val="2"/>
+          <w:sz w:val="24"/>
+          <w:szCs w:val="24"/>
+          <w:lang w:val="en-IN"/>
+          <w14:ligatures w14:val="standardContextual"/>
+        </w:rPr>
+        <w:t>com.greenwood</w:t>
+      </w:r>
+      <w:proofErr w:type="gramEnd"/>
+      <w:r>
+        <w:rPr>
+          <w:rFonts w:asciiTheme="minorHAnsi" w:eastAsiaTheme="minorHAnsi" w:hAnsiTheme="minorHAnsi" w:cstheme="minorBidi"/>
+          <w:kern w:val="2"/>
+          <w:sz w:val="24"/>
+          <w:szCs w:val="24"/>
+          <w:lang w:val="en-IN"/>
+          <w14:ligatures w14:val="standardContextual"/>
+        </w:rPr>
+        <w:t>.</w:t>
+      </w:r>
+      <w:proofErr w:type="gramStart"/>
+      <w:r>
+        <w:rPr>
+          <w:rFonts w:asciiTheme="minorHAnsi" w:eastAsiaTheme="minorHAnsi" w:hAnsiTheme="minorHAnsi" w:cstheme="minorBidi"/>
+          <w:kern w:val="2"/>
+          <w:sz w:val="24"/>
+          <w:szCs w:val="24"/>
+          <w:lang w:val="en-IN"/>
+          <w14:ligatures w14:val="standardContextual"/>
+        </w:rPr>
+        <w:t>identity.controller</w:t>
+      </w:r>
+      <w:proofErr w:type="spellEnd"/>
+      <w:proofErr w:type="gramEnd"/>
+      <w:r>
+        <w:rPr>
+          <w:rFonts w:asciiTheme="minorHAnsi" w:eastAsiaTheme="minorHAnsi" w:hAnsiTheme="minorHAnsi" w:cstheme="minorBidi"/>
+          <w:kern w:val="2"/>
+          <w:sz w:val="24"/>
+          <w:szCs w:val="24"/>
+          <w:lang w:val="en-IN"/>
+          <w14:ligatures w14:val="standardContextual"/>
+        </w:rPr>
+        <w:t>;</w:t>
+      </w:r>
+    </w:p>
+    <w:p>
+      <w:pPr>
+        <w:pStyle w:val="HTMLPreformatted"/>
+        <w:rPr>
+          <w:rFonts w:asciiTheme="minorHAnsi" w:eastAsiaTheme="minorHAnsi" w:hAnsiTheme="minorHAnsi" w:cstheme="minorBidi"/>
+          <w:kern w:val="2"/>
+          <w:sz w:val="24"/>
+          <w:szCs w:val="24"/>
+          <w:lang w:val="en-IN"/>
+          <w14:ligatures w14:val="standardContextual"/>
+        </w:rPr>
+      </w:pPr>
+    </w:p>
+    <w:p>
+      <w:pPr>
+        <w:pStyle w:val="HTMLPreformatted"/>
+        <w:rPr>
+          <w:rFonts w:asciiTheme="minorHAnsi" w:eastAsiaTheme="minorHAnsi" w:hAnsiTheme="minorHAnsi" w:cstheme="minorBidi"/>
+          <w:kern w:val="2"/>
+          <w:sz w:val="24"/>
+          <w:szCs w:val="24"/>
+          <w:lang w:val="en-IN"/>
+          <w14:ligatures w14:val="standardContextual"/>
+        </w:rPr>
+      </w:pPr>
+      <w:r>
+        <w:rPr>
+          <w:rFonts w:asciiTheme="minorHAnsi" w:eastAsiaTheme="minorHAnsi" w:hAnsiTheme="minorHAnsi" w:cstheme="minorBidi"/>
+          <w:kern w:val="2"/>
+          <w:sz w:val="24"/>
+          <w:szCs w:val="24"/>
+          <w:lang w:val="en-IN"/>
+          <w14:ligatures w14:val="standardContextual"/>
+        </w:rPr>
+        <w:t xml:space="preserve">import </w:t>
+      </w:r>
+      <w:proofErr w:type="spellStart"/>
+      <w:proofErr w:type="gramStart"/>
+      <w:r>
+        <w:rPr>
+          <w:rFonts w:asciiTheme="minorHAnsi" w:eastAsiaTheme="minorHAnsi" w:hAnsiTheme="minorHAnsi" w:cstheme="minorBidi"/>
+          <w:kern w:val="2"/>
+          <w:sz w:val="24"/>
+          <w:szCs w:val="24"/>
+          <w:lang w:val="en-IN"/>
+          <w14:ligatures w14:val="standardContextual"/>
+        </w:rPr>
+        <w:t>com.greenwood</w:t>
+      </w:r>
+      <w:proofErr w:type="gramEnd"/>
+      <w:r>
+        <w:rPr>
+          <w:rFonts w:asciiTheme="minorHAnsi" w:eastAsiaTheme="minorHAnsi" w:hAnsiTheme="minorHAnsi" w:cstheme="minorBidi"/>
+          <w:kern w:val="2"/>
+          <w:sz w:val="24"/>
+          <w:szCs w:val="24"/>
+          <w:lang w:val="en-IN"/>
+          <w14:ligatures w14:val="standardContextual"/>
+        </w:rPr>
+        <w:t>.</w:t>
+      </w:r>
+      <w:proofErr w:type="gramStart"/>
+      <w:r>
+        <w:rPr>
+          <w:rFonts w:asciiTheme="minorHAnsi" w:eastAsiaTheme="minorHAnsi" w:hAnsiTheme="minorHAnsi" w:cstheme="minorBidi"/>
+          <w:kern w:val="2"/>
+          <w:sz w:val="24"/>
+          <w:szCs w:val="24"/>
+          <w:lang w:val="en-IN"/>
+          <w14:ligatures w14:val="standardContextual"/>
+        </w:rPr>
+        <w:t>identity.model</w:t>
+      </w:r>
+      <w:proofErr w:type="gramEnd"/>
+      <w:r>
+        <w:rPr>
+          <w:rFonts w:asciiTheme="minorHAnsi" w:eastAsiaTheme="minorHAnsi" w:hAnsiTheme="minorHAnsi" w:cstheme="minorBidi"/>
+          <w:kern w:val="2"/>
+          <w:sz w:val="24"/>
+          <w:szCs w:val="24"/>
+          <w:lang w:val="en-IN"/>
+          <w14:ligatures w14:val="standardContextual"/>
+        </w:rPr>
+        <w:t>.Student</w:t>
+      </w:r>
+      <w:proofErr w:type="spellEnd"/>
+      <w:r>
+        <w:rPr>
+          <w:rFonts w:asciiTheme="minorHAnsi" w:eastAsiaTheme="minorHAnsi" w:hAnsiTheme="minorHAnsi" w:cstheme="minorBidi"/>
+          <w:kern w:val="2"/>
+          <w:sz w:val="24"/>
+          <w:szCs w:val="24"/>
+          <w:lang w:val="en-IN"/>
+          <w14:ligatures w14:val="standardContextual"/>
+        </w:rPr>
+        <w:t>;</w:t>
+      </w:r>
+    </w:p>
+    <w:p>
+      <w:pPr>
+        <w:pStyle w:val="HTMLPreformatted"/>
+        <w:rPr>
+          <w:rFonts w:asciiTheme="minorHAnsi" w:eastAsiaTheme="minorHAnsi" w:hAnsiTheme="minorHAnsi" w:cstheme="minorBidi"/>
+          <w:kern w:val="2"/>
+          <w:sz w:val="24"/>
+          <w:szCs w:val="24"/>
+          <w:lang w:val="en-IN"/>
+          <w14:ligatures w14:val="standardContextual"/>
+        </w:rPr>
+      </w:pPr>
+      <w:r>
+        <w:rPr>
+          <w:rFonts w:asciiTheme="minorHAnsi" w:eastAsiaTheme="minorHAnsi" w:hAnsiTheme="minorHAnsi" w:cstheme="minorBidi"/>
+          <w:kern w:val="2"/>
+          <w:sz w:val="24"/>
+          <w:szCs w:val="24"/>
+          <w:lang w:val="en-IN"/>
+          <w14:ligatures w14:val="standardContextual"/>
+        </w:rPr>
+        <w:t xml:space="preserve">import </w:t>
+      </w:r>
+      <w:proofErr w:type="spellStart"/>
+      <w:proofErr w:type="gramStart"/>
+      <w:r>
+        <w:rPr>
+          <w:rFonts w:asciiTheme="minorHAnsi" w:eastAsiaTheme="minorHAnsi" w:hAnsiTheme="minorHAnsi" w:cstheme="minorBidi"/>
+          <w:kern w:val="2"/>
+          <w:sz w:val="24"/>
+          <w:szCs w:val="24"/>
+          <w:lang w:val="en-IN"/>
+          <w14:ligatures w14:val="standardContextual"/>
+        </w:rPr>
+        <w:t>org.springframework.web.bind</w:t>
+      </w:r>
+      <w:proofErr w:type="gramEnd"/>
+      <w:r>
+        <w:rPr>
+          <w:rFonts w:asciiTheme="minorHAnsi" w:eastAsiaTheme="minorHAnsi" w:hAnsiTheme="minorHAnsi" w:cstheme="minorBidi"/>
+          <w:kern w:val="2"/>
+          <w:sz w:val="24"/>
+          <w:szCs w:val="24"/>
+          <w:lang w:val="en-IN"/>
+          <w14:ligatures w14:val="standardContextual"/>
+        </w:rPr>
+        <w:t>.</w:t>
+      </w:r>
+      <w:proofErr w:type="gramStart"/>
+      <w:r>
+        <w:rPr>
+          <w:rFonts w:asciiTheme="minorHAnsi" w:eastAsiaTheme="minorHAnsi" w:hAnsiTheme="minorHAnsi" w:cstheme="minorBidi"/>
+          <w:kern w:val="2"/>
+          <w:sz w:val="24"/>
+          <w:szCs w:val="24"/>
+          <w:lang w:val="en-IN"/>
+          <w14:ligatures w14:val="standardContextual"/>
+        </w:rPr>
+        <w:t>annotation</w:t>
+      </w:r>
+      <w:proofErr w:type="spellEnd"/>
+      <w:r>
+        <w:rPr>
+          <w:rFonts w:asciiTheme="minorHAnsi" w:eastAsiaTheme="minorHAnsi" w:hAnsiTheme="minorHAnsi" w:cstheme="minorBidi"/>
+          <w:kern w:val="2"/>
+          <w:sz w:val="24"/>
+          <w:szCs w:val="24"/>
+          <w:lang w:val="en-IN"/>
+          <w14:ligatures w14:val="standardContextual"/>
+        </w:rPr>
+        <w:t>.*</w:t>
+      </w:r>
+      <w:proofErr w:type="gramEnd"/>
+      <w:r>
+        <w:rPr>
+          <w:rFonts w:asciiTheme="minorHAnsi" w:eastAsiaTheme="minorHAnsi" w:hAnsiTheme="minorHAnsi" w:cstheme="minorBidi"/>
+          <w:kern w:val="2"/>
+          <w:sz w:val="24"/>
+          <w:szCs w:val="24"/>
+          <w:lang w:val="en-IN"/>
+          <w14:ligatures w14:val="standardContextual"/>
+        </w:rPr>
+        <w:t>;</w:t>
+      </w:r>
+    </w:p>
+    <w:p>
+      <w:pPr>
+        <w:pStyle w:val="HTMLPreformatted"/>
+        <w:rPr>
+          <w:rFonts w:asciiTheme="minorHAnsi" w:eastAsiaTheme="minorHAnsi" w:hAnsiTheme="minorHAnsi" w:cstheme="minorBidi"/>
+          <w:kern w:val="2"/>
+          <w:sz w:val="24"/>
+          <w:szCs w:val="24"/>
+          <w:lang w:val="en-IN"/>
+          <w14:ligatures w14:val="standardContextual"/>
+        </w:rPr>
+      </w:pPr>
+      <w:r>
+        <w:rPr>
+          <w:rFonts w:asciiTheme="minorHAnsi" w:eastAsiaTheme="minorHAnsi" w:hAnsiTheme="minorHAnsi" w:cstheme="minorBidi"/>
+          <w:kern w:val="2"/>
+          <w:sz w:val="24"/>
+          <w:szCs w:val="24"/>
+          <w:lang w:val="en-IN"/>
+          <w14:ligatures w14:val="standardContextual"/>
+        </w:rPr>
+        <w:t xml:space="preserve">import </w:t>
+      </w:r>
+      <w:proofErr w:type="spellStart"/>
+      <w:proofErr w:type="gramStart"/>
+      <w:r>
+        <w:rPr>
+          <w:rFonts w:asciiTheme="minorHAnsi" w:eastAsiaTheme="minorHAnsi" w:hAnsiTheme="minorHAnsi" w:cstheme="minorBidi"/>
+          <w:kern w:val="2"/>
+          <w:sz w:val="24"/>
+          <w:szCs w:val="24"/>
+          <w:lang w:val="en-IN"/>
+          <w14:ligatures w14:val="standardContextual"/>
+        </w:rPr>
+        <w:t>org.springframework</w:t>
+      </w:r>
+      <w:proofErr w:type="gramEnd"/>
+      <w:r>
+        <w:rPr>
+          <w:rFonts w:asciiTheme="minorHAnsi" w:eastAsiaTheme="minorHAnsi" w:hAnsiTheme="minorHAnsi" w:cstheme="minorBidi"/>
+          <w:kern w:val="2"/>
+          <w:sz w:val="24"/>
+          <w:szCs w:val="24"/>
+          <w:lang w:val="en-IN"/>
+          <w14:ligatures w14:val="standardContextual"/>
+        </w:rPr>
+        <w:t>.</w:t>
+      </w:r>
+      <w:proofErr w:type="gramStart"/>
+      <w:r>
+        <w:rPr>
+          <w:rFonts w:asciiTheme="minorHAnsi" w:eastAsiaTheme="minorHAnsi" w:hAnsiTheme="minorHAnsi" w:cstheme="minorBidi"/>
+          <w:kern w:val="2"/>
+          <w:sz w:val="24"/>
+          <w:szCs w:val="24"/>
+          <w:lang w:val="en-IN"/>
+          <w14:ligatures w14:val="standardContextual"/>
+        </w:rPr>
+        <w:t>http.ResponseEntity</w:t>
+      </w:r>
+      <w:proofErr w:type="spellEnd"/>
+      <w:proofErr w:type="gramEnd"/>
+      <w:r>
+        <w:rPr>
+          <w:rFonts w:asciiTheme="minorHAnsi" w:eastAsiaTheme="minorHAnsi" w:hAnsiTheme="minorHAnsi" w:cstheme="minorBidi"/>
+          <w:kern w:val="2"/>
+          <w:sz w:val="24"/>
+          <w:szCs w:val="24"/>
+          <w:lang w:val="en-IN"/>
+          <w14:ligatures w14:val="standardContextual"/>
+        </w:rPr>
+        <w:t>;</w:t>
+      </w:r>
+    </w:p>
+    <w:p>
+      <w:pPr>
+        <w:pStyle w:val="HTMLPreformatted"/>
+        <w:rPr>
+          <w:rFonts w:asciiTheme="minorHAnsi" w:eastAsiaTheme="minorHAnsi" w:hAnsiTheme="minorHAnsi" w:cstheme="minorBidi"/>
+          <w:kern w:val="2"/>
+          <w:sz w:val="24"/>
+          <w:szCs w:val="24"/>
+          <w:lang w:val="en-IN"/>
+          <w14:ligatures w14:val="standardContextual"/>
+        </w:rPr>
+      </w:pPr>
+      <w:r>
+        <w:rPr>
+          <w:rFonts w:asciiTheme="minorHAnsi" w:eastAsiaTheme="minorHAnsi" w:hAnsiTheme="minorHAnsi" w:cstheme="minorBidi"/>
+          <w:kern w:val="2"/>
+          <w:sz w:val="24"/>
+          <w:szCs w:val="24"/>
+          <w:lang w:val="en-IN"/>
+          <w14:ligatures w14:val="standardContextual"/>
+        </w:rPr>
+        <w:t xml:space="preserve">import </w:t>
+      </w:r>
+      <w:proofErr w:type="spellStart"/>
+      <w:proofErr w:type="gramStart"/>
+      <w:r>
+        <w:rPr>
+          <w:rFonts w:asciiTheme="minorHAnsi" w:eastAsiaTheme="minorHAnsi" w:hAnsiTheme="minorHAnsi" w:cstheme="minorBidi"/>
+          <w:kern w:val="2"/>
+          <w:sz w:val="24"/>
+          <w:szCs w:val="24"/>
+          <w:lang w:val="en-IN"/>
+          <w14:ligatures w14:val="standardContextual"/>
+        </w:rPr>
+        <w:t>java.util</w:t>
+      </w:r>
+      <w:proofErr w:type="gramEnd"/>
+      <w:r>
+        <w:rPr>
+          <w:rFonts w:asciiTheme="minorHAnsi" w:eastAsiaTheme="minorHAnsi" w:hAnsiTheme="minorHAnsi" w:cstheme="minorBidi"/>
+          <w:kern w:val="2"/>
+          <w:sz w:val="24"/>
+          <w:szCs w:val="24"/>
+          <w:lang w:val="en-IN"/>
+          <w14:ligatures w14:val="standardContextual"/>
+        </w:rPr>
+        <w:t>.HashMap</w:t>
+      </w:r>
+      <w:proofErr w:type="spellEnd"/>
+      <w:r>
+        <w:rPr>
+          <w:rFonts w:asciiTheme="minorHAnsi" w:eastAsiaTheme="minorHAnsi" w:hAnsiTheme="minorHAnsi" w:cstheme="minorBidi"/>
+          <w:kern w:val="2"/>
+          <w:sz w:val="24"/>
+          <w:szCs w:val="24"/>
+          <w:lang w:val="en-IN"/>
+          <w14:ligatures w14:val="standardContextual"/>
+        </w:rPr>
+        <w:t>;</w:t>
+      </w:r>
+    </w:p>
+    <w:p>
+      <w:pPr>
+        <w:pStyle w:val="HTMLPreformatted"/>
+        <w:rPr>
+          <w:rFonts w:asciiTheme="minorHAnsi" w:eastAsiaTheme="minorHAnsi" w:hAnsiTheme="minorHAnsi" w:cstheme="minorBidi"/>
+          <w:kern w:val="2"/>
+          <w:sz w:val="24"/>
+          <w:szCs w:val="24"/>
+          <w:lang w:val="en-IN"/>
+          <w14:ligatures w14:val="standardContextual"/>
+        </w:rPr>
+      </w:pPr>
+      <w:r>
+        <w:rPr>
+          <w:rFonts w:asciiTheme="minorHAnsi" w:eastAsiaTheme="minorHAnsi" w:hAnsiTheme="minorHAnsi" w:cstheme="minorBidi"/>
+          <w:kern w:val="2"/>
+          <w:sz w:val="24"/>
+          <w:szCs w:val="24"/>
+          <w:lang w:val="en-IN"/>
+          <w14:ligatures w14:val="standardContextual"/>
+        </w:rPr>
+        <w:t xml:space="preserve">import </w:t>
+      </w:r>
+      <w:proofErr w:type="spellStart"/>
+      <w:proofErr w:type="gramStart"/>
+      <w:r>
+        <w:rPr>
+          <w:rFonts w:asciiTheme="minorHAnsi" w:eastAsiaTheme="minorHAnsi" w:hAnsiTheme="minorHAnsi" w:cstheme="minorBidi"/>
+          <w:kern w:val="2"/>
+          <w:sz w:val="24"/>
+          <w:szCs w:val="24"/>
+          <w:lang w:val="en-IN"/>
+          <w14:ligatures w14:val="standardContextual"/>
+        </w:rPr>
+        <w:t>java.util</w:t>
+      </w:r>
+      <w:proofErr w:type="gramEnd"/>
+      <w:r>
+        <w:rPr>
+          <w:rFonts w:asciiTheme="minorHAnsi" w:eastAsiaTheme="minorHAnsi" w:hAnsiTheme="minorHAnsi" w:cstheme="minorBidi"/>
+          <w:kern w:val="2"/>
+          <w:sz w:val="24"/>
+          <w:szCs w:val="24"/>
+          <w:lang w:val="en-IN"/>
+          <w14:ligatures w14:val="standardContextual"/>
+        </w:rPr>
+        <w:t>.Map</w:t>
+      </w:r>
+      <w:proofErr w:type="spellEnd"/>
+      <w:r>
+        <w:rPr>
+          <w:rFonts w:asciiTheme="minorHAnsi" w:eastAsiaTheme="minorHAnsi" w:hAnsiTheme="minorHAnsi" w:cstheme="minorBidi"/>
+          <w:kern w:val="2"/>
+          <w:sz w:val="24"/>
+          <w:szCs w:val="24"/>
+          <w:lang w:val="en-IN"/>
+          <w14:ligatures w14:val="standardContextual"/>
+        </w:rPr>
+        <w:t>;</w:t>
+      </w:r>
+    </w:p>
+    <w:p>
+      <w:pPr>
+        <w:pStyle w:val="HTMLPreformatted"/>
+        <w:rPr>
+          <w:rFonts w:asciiTheme="minorHAnsi" w:eastAsiaTheme="minorHAnsi" w:hAnsiTheme="minorHAnsi" w:cstheme="minorBidi"/>
+          <w:kern w:val="2"/>
+          <w:sz w:val="24"/>
+          <w:szCs w:val="24"/>
+          <w:lang w:val="en-IN"/>
+          <w14:ligatures w14:val="standardContextual"/>
+        </w:rPr>
+      </w:pPr>
+    </w:p>
+    <w:p>
+      <w:pPr>
+        <w:pStyle w:val="HTMLPreformatted"/>
+        <w:rPr>
+          <w:rFonts w:asciiTheme="minorHAnsi" w:eastAsiaTheme="minorHAnsi" w:hAnsiTheme="minorHAnsi" w:cstheme="minorBidi"/>
+          <w:kern w:val="2"/>
+          <w:sz w:val="24"/>
+          <w:szCs w:val="24"/>
+          <w:lang w:val="en-IN"/>
+          <w14:ligatures w14:val="standardContextual"/>
+        </w:rPr>
+      </w:pPr>
+      <w:r>
+        <w:rPr>
+          <w:rFonts w:asciiTheme="minorHAnsi" w:eastAsiaTheme="minorHAnsi" w:hAnsiTheme="minorHAnsi" w:cstheme="minorBidi"/>
+          <w:kern w:val="2"/>
+          <w:sz w:val="24"/>
+          <w:szCs w:val="24"/>
+          <w:lang w:val="en-IN"/>
+          <w14:ligatures w14:val="standardContextual"/>
+        </w:rPr>
+        <w:t>@RestController</w:t>
+      </w:r>
+    </w:p>
+    <w:p>
+      <w:pPr>
+        <w:pStyle w:val="HTMLPreformatted"/>
+        <w:rPr>
+          <w:rFonts w:asciiTheme="minorHAnsi" w:eastAsiaTheme="minorHAnsi" w:hAnsiTheme="minorHAnsi" w:cstheme="minorBidi"/>
+          <w:kern w:val="2"/>
+          <w:sz w:val="24"/>
+          <w:szCs w:val="24"/>
+          <w:lang w:val="en-IN"/>
+          <w14:ligatures w14:val="standardContextual"/>
+        </w:rPr>
+      </w:pPr>
+      <w:r>
+        <w:rPr>
+          <w:rFonts w:asciiTheme="minorHAnsi" w:eastAsiaTheme="minorHAnsi" w:hAnsiTheme="minorHAnsi" w:cstheme="minorBidi"/>
+          <w:kern w:val="2"/>
+          <w:sz w:val="24"/>
+          <w:szCs w:val="24"/>
+          <w:lang w:val="en-IN"/>
+          <w14:ligatures w14:val="standardContextual"/>
+        </w:rPr>
+        <w:t>@RequestMapping("/api/students")</w:t>
+      </w:r>
+    </w:p>
+    <w:p>
+      <w:pPr>
+        <w:pStyle w:val="HTMLPreformatted"/>
+        <w:rPr>
+          <w:rFonts w:asciiTheme="minorHAnsi" w:eastAsiaTheme="minorHAnsi" w:hAnsiTheme="minorHAnsi" w:cstheme="minorBidi"/>
+          <w:kern w:val="2"/>
+          <w:sz w:val="24"/>
+          <w:szCs w:val="24"/>
+          <w:lang w:val="en-IN"/>
+          <w14:ligatures w14:val="standardContextual"/>
+        </w:rPr>
+      </w:pPr>
+      <w:r>
+        <w:rPr>
+          <w:rFonts w:asciiTheme="minorHAnsi" w:eastAsiaTheme="minorHAnsi" w:hAnsiTheme="minorHAnsi" w:cstheme="minorBidi"/>
+          <w:kern w:val="2"/>
+          <w:sz w:val="24"/>
+          <w:szCs w:val="24"/>
+          <w:lang w:val="en-IN"/>
+          <w14:ligatures w14:val="standardContextual"/>
+        </w:rPr>
+        <w:t xml:space="preserve">public class </w:t>
+      </w:r>
+      <w:proofErr w:type="spellStart"/>
+      <w:r>
+        <w:rPr>
+          <w:rFonts w:asciiTheme="minorHAnsi" w:eastAsiaTheme="minorHAnsi" w:hAnsiTheme="minorHAnsi" w:cstheme="minorBidi"/>
+          <w:kern w:val="2"/>
+          <w:sz w:val="24"/>
+          <w:szCs w:val="24"/>
+          <w:lang w:val="en-IN"/>
+          <w14:ligatures w14:val="standardContextual"/>
+        </w:rPr>
+        <w:t>StudentController</w:t>
+      </w:r>
+      <w:proofErr w:type="spellEnd"/>
+      <w:r>
+        <w:rPr>
+          <w:rFonts w:asciiTheme="minorHAnsi" w:eastAsiaTheme="minorHAnsi" w:hAnsiTheme="minorHAnsi" w:cstheme="minorBidi"/>
+          <w:kern w:val="2"/>
+          <w:sz w:val="24"/>
+          <w:szCs w:val="24"/>
+          <w:lang w:val="en-IN"/>
+          <w14:ligatures w14:val="standardContextual"/>
+        </w:rPr>
+        <w:t xml:space="preserve"> {</w:t>
+      </w:r>
+    </w:p>
+    <w:p>
+      <w:pPr>
+        <w:pStyle w:val="HTMLPreformatted"/>
+        <w:rPr>
+          <w:rFonts w:asciiTheme="minorHAnsi" w:eastAsiaTheme="minorHAnsi" w:hAnsiTheme="minorHAnsi" w:cstheme="minorBidi"/>
+          <w:kern w:val="2"/>
+          <w:sz w:val="24"/>
+          <w:szCs w:val="24"/>
+          <w:lang w:val="en-IN"/>
+          <w14:ligatures w14:val="standardContextual"/>
+        </w:rPr>
+      </w:pPr>
+      <w:r>
+        <w:rPr>
+          <w:rFonts w:asciiTheme="minorHAnsi" w:eastAsiaTheme="minorHAnsi" w:hAnsiTheme="minorHAnsi" w:cstheme="minorBidi"/>
+          <w:kern w:val="2"/>
+          <w:sz w:val="24"/>
+          <w:szCs w:val="24"/>
+          <w:lang w:val="en-IN"/>
+          <w14:ligatures w14:val="standardContextual"/>
+        </w:rPr>
+        <w:t xml:space="preserve">    </w:t>
+      </w:r>
+    </w:p>
+    <w:p>
+      <w:pPr>
+        <w:pStyle w:val="HTMLPreformatted"/>
+        <w:rPr>
+          <w:rFonts w:asciiTheme="minorHAnsi" w:eastAsiaTheme="minorHAnsi" w:hAnsiTheme="minorHAnsi" w:cstheme="minorBidi"/>
+          <w:kern w:val="2"/>
+          <w:sz w:val="24"/>
+          <w:szCs w:val="24"/>
+          <w:lang w:val="en-IN"/>
+          <w14:ligatures w14:val="standardContextual"/>
+        </w:rPr>
+      </w:pPr>
+      <w:r>
+        <w:rPr>
+          <w:rFonts w:asciiTheme="minorHAnsi" w:eastAsiaTheme="minorHAnsi" w:hAnsiTheme="minorHAnsi" w:cstheme="minorBidi"/>
+          <w:kern w:val="2"/>
+          <w:sz w:val="24"/>
+          <w:szCs w:val="24"/>
+          <w:lang w:val="en-IN"/>
+          <w14:ligatures w14:val="standardContextual"/>
+        </w:rPr>
+        <w:t xml:space="preserve">    private static final Map&lt;Long, Student&gt; </w:t>
+      </w:r>
+      <w:proofErr w:type="spellStart"/>
+      <w:r>
+        <w:rPr>
+          <w:rFonts w:asciiTheme="minorHAnsi" w:eastAsiaTheme="minorHAnsi" w:hAnsiTheme="minorHAnsi" w:cstheme="minorBidi"/>
+          <w:kern w:val="2"/>
+          <w:sz w:val="24"/>
+          <w:szCs w:val="24"/>
+          <w:lang w:val="en-IN"/>
+          <w14:ligatures w14:val="standardContextual"/>
+        </w:rPr>
+        <w:t>studentMap</w:t>
+      </w:r>
+      <w:proofErr w:type="spellEnd"/>
+      <w:r>
+        <w:rPr>
+          <w:rFonts w:asciiTheme="minorHAnsi" w:eastAsiaTheme="minorHAnsi" w:hAnsiTheme="minorHAnsi" w:cstheme="minorBidi"/>
+          <w:kern w:val="2"/>
+          <w:sz w:val="24"/>
+          <w:szCs w:val="24"/>
+          <w:lang w:val="en-IN"/>
+          <w14:ligatures w14:val="standardContextual"/>
+        </w:rPr>
+        <w:t xml:space="preserve"> = new HashMap&lt;</w:t>
+      </w:r>
+      <w:proofErr w:type="gramStart"/>
+      <w:r>
+        <w:rPr>
+          <w:rFonts w:asciiTheme="minorHAnsi" w:eastAsiaTheme="minorHAnsi" w:hAnsiTheme="minorHAnsi" w:cstheme="minorBidi"/>
+          <w:kern w:val="2"/>
+          <w:sz w:val="24"/>
+          <w:szCs w:val="24"/>
+          <w:lang w:val="en-IN"/>
+          <w14:ligatures w14:val="standardContextual"/>
+        </w:rPr>
+        <w:t>&gt;(</w:t>
+      </w:r>
+      <w:proofErr w:type="gramEnd"/>
+      <w:r>
+        <w:rPr>
+          <w:rFonts w:asciiTheme="minorHAnsi" w:eastAsiaTheme="minorHAnsi" w:hAnsiTheme="minorHAnsi" w:cstheme="minorBidi"/>
+          <w:kern w:val="2"/>
+          <w:sz w:val="24"/>
+          <w:szCs w:val="24"/>
+          <w:lang w:val="en-IN"/>
+          <w14:ligatures w14:val="standardContextual"/>
+        </w:rPr>
+        <w:t>);</w:t>
+      </w:r>
+    </w:p>
+    <w:p>
+      <w:pPr>
+        <w:pStyle w:val="HTMLPreformatted"/>
+        <w:rPr>
+          <w:rFonts w:asciiTheme="minorHAnsi" w:eastAsiaTheme="minorHAnsi" w:hAnsiTheme="minorHAnsi" w:cstheme="minorBidi"/>
+          <w:kern w:val="2"/>
+          <w:sz w:val="24"/>
+          <w:szCs w:val="24"/>
+          <w:lang w:val="en-IN"/>
+          <w14:ligatures w14:val="standardContextual"/>
+        </w:rPr>
+      </w:pPr>
+    </w:p>
+    <w:p>
+      <w:pPr>
+        <w:pStyle w:val="HTMLPreformatted"/>
+        <w:rPr>
+          <w:rFonts w:asciiTheme="minorHAnsi" w:eastAsiaTheme="minorHAnsi" w:hAnsiTheme="minorHAnsi" w:cstheme="minorBidi"/>
+          <w:kern w:val="2"/>
+          <w:sz w:val="24"/>
+          <w:szCs w:val="24"/>
+          <w:lang w:val="en-IN"/>
+          <w14:ligatures w14:val="standardContextual"/>
+        </w:rPr>
+      </w:pPr>
+      <w:r>
+        <w:rPr>
+          <w:rFonts w:asciiTheme="minorHAnsi" w:eastAsiaTheme="minorHAnsi" w:hAnsiTheme="minorHAnsi" w:cstheme="minorBidi"/>
+          <w:kern w:val="2"/>
+          <w:sz w:val="24"/>
+          <w:szCs w:val="24"/>
+          <w:lang w:val="en-IN"/>
+          <w14:ligatures w14:val="standardContextual"/>
+        </w:rPr>
+        <w:t xml:space="preserve">    static {</w:t>
+      </w:r>
+    </w:p>
+    <w:p>
+      <w:pPr>
+        <w:pStyle w:val="HTMLPreformatted"/>
+        <w:rPr>
+          <w:rFonts w:asciiTheme="minorHAnsi" w:eastAsiaTheme="minorHAnsi" w:hAnsiTheme="minorHAnsi" w:cstheme="minorBidi"/>
+          <w:kern w:val="2"/>
+          <w:sz w:val="24"/>
+          <w:szCs w:val="24"/>
+          <w:lang w:val="en-IN"/>
+          <w14:ligatures w14:val="standardContextual"/>
+        </w:rPr>
+      </w:pPr>
+      <w:r>
+        <w:rPr>
+          <w:rFonts w:asciiTheme="minorHAnsi" w:eastAsiaTheme="minorHAnsi" w:hAnsiTheme="minorHAnsi" w:cstheme="minorBidi"/>
+          <w:kern w:val="2"/>
+          <w:sz w:val="24"/>
+          <w:szCs w:val="24"/>
+          <w:lang w:val="en-IN"/>
+          <w14:ligatures w14:val="standardContextual"/>
+        </w:rPr>
+        <w:t xml:space="preserve">        </w:t>
+      </w:r>
+      <w:proofErr w:type="spellStart"/>
+      <w:proofErr w:type="gramStart"/>
+      <w:r>
+        <w:rPr>
+          <w:rFonts w:asciiTheme="minorHAnsi" w:eastAsiaTheme="minorHAnsi" w:hAnsiTheme="minorHAnsi" w:cstheme="minorBidi"/>
+          <w:kern w:val="2"/>
+          <w:sz w:val="24"/>
+          <w:szCs w:val="24"/>
+          <w:lang w:val="en-IN"/>
+          <w14:ligatures w14:val="standardContextual"/>
+        </w:rPr>
+        <w:t>studentMap.put</w:t>
+      </w:r>
+      <w:proofErr w:type="spellEnd"/>
+      <w:r>
+        <w:rPr>
+          <w:rFonts w:asciiTheme="minorHAnsi" w:eastAsiaTheme="minorHAnsi" w:hAnsiTheme="minorHAnsi" w:cstheme="minorBidi"/>
+          <w:kern w:val="2"/>
+          <w:sz w:val="24"/>
+          <w:szCs w:val="24"/>
+          <w:lang w:val="en-IN"/>
+          <w14:ligatures w14:val="standardContextual"/>
+        </w:rPr>
+        <w:t>(</w:t>
+      </w:r>
+      <w:proofErr w:type="gramEnd"/>
+      <w:r>
+        <w:rPr>
+          <w:rFonts w:asciiTheme="minorHAnsi" w:eastAsiaTheme="minorHAnsi" w:hAnsiTheme="minorHAnsi" w:cstheme="minorBidi"/>
+          <w:kern w:val="2"/>
+          <w:sz w:val="24"/>
+          <w:szCs w:val="24"/>
+          <w:lang w:val="en-IN"/>
+          <w14:ligatures w14:val="standardContextual"/>
+        </w:rPr>
+        <w:t xml:space="preserve">1L, new </w:t>
+      </w:r>
+      <w:proofErr w:type="gramStart"/>
+      <w:r>
+        <w:rPr>
+          <w:rFonts w:asciiTheme="minorHAnsi" w:eastAsiaTheme="minorHAnsi" w:hAnsiTheme="minorHAnsi" w:cstheme="minorBidi"/>
+          <w:kern w:val="2"/>
+          <w:sz w:val="24"/>
+          <w:szCs w:val="24"/>
+          <w:lang w:val="en-IN"/>
+          <w14:ligatures w14:val="standardContextual"/>
+        </w:rPr>
+        <w:t>Student(</w:t>
+      </w:r>
+      <w:proofErr w:type="gramEnd"/>
+      <w:r>
+        <w:rPr>
+          <w:rFonts w:asciiTheme="minorHAnsi" w:eastAsiaTheme="minorHAnsi" w:hAnsiTheme="minorHAnsi" w:cstheme="minorBidi"/>
+          <w:kern w:val="2"/>
+          <w:sz w:val="24"/>
+          <w:szCs w:val="24"/>
+          <w:lang w:val="en-IN"/>
+          <w14:ligatures w14:val="standardContextual"/>
+        </w:rPr>
+        <w:t>1L, "John Doe"));</w:t>
+      </w:r>
+    </w:p>
+    <w:p>
+      <w:pPr>
+        <w:pStyle w:val="HTMLPreformatted"/>
+        <w:rPr>
+          <w:rFonts w:asciiTheme="minorHAnsi" w:eastAsiaTheme="minorHAnsi" w:hAnsiTheme="minorHAnsi" w:cstheme="minorBidi"/>
+          <w:kern w:val="2"/>
+          <w:sz w:val="24"/>
+          <w:szCs w:val="24"/>
+          <w:lang w:val="en-IN"/>
+          <w14:ligatures w14:val="standardContextual"/>
+        </w:rPr>
+      </w:pPr>
+      <w:r>
+        <w:rPr>
+          <w:rFonts w:asciiTheme="minorHAnsi" w:eastAsiaTheme="minorHAnsi" w:hAnsiTheme="minorHAnsi" w:cstheme="minorBidi"/>
+          <w:kern w:val="2"/>
+          <w:sz w:val="24"/>
+          <w:szCs w:val="24"/>
+          <w:lang w:val="en-IN"/>
+          <w14:ligatures w14:val="standardContextual"/>
+        </w:rPr>
+        <w:t xml:space="preserve">        </w:t>
+      </w:r>
+      <w:proofErr w:type="spellStart"/>
+      <w:proofErr w:type="gramStart"/>
+      <w:r>
+        <w:rPr>
+          <w:rFonts w:asciiTheme="minorHAnsi" w:eastAsiaTheme="minorHAnsi" w:hAnsiTheme="minorHAnsi" w:cstheme="minorBidi"/>
+          <w:kern w:val="2"/>
+          <w:sz w:val="24"/>
+          <w:szCs w:val="24"/>
+          <w:lang w:val="en-IN"/>
+          <w14:ligatures w14:val="standardContextual"/>
+        </w:rPr>
+        <w:t>studentMap.put</w:t>
+      </w:r>
+      <w:proofErr w:type="spellEnd"/>
+      <w:r>
+        <w:rPr>
+          <w:rFonts w:asciiTheme="minorHAnsi" w:eastAsiaTheme="minorHAnsi" w:hAnsiTheme="minorHAnsi" w:cstheme="minorBidi"/>
+          <w:kern w:val="2"/>
+          <w:sz w:val="24"/>
+          <w:szCs w:val="24"/>
+          <w:lang w:val="en-IN"/>
+          <w14:ligatures w14:val="standardContextual"/>
+        </w:rPr>
+        <w:t>(</w:t>
+      </w:r>
+      <w:proofErr w:type="gramEnd"/>
+      <w:r>
+        <w:rPr>
+          <w:rFonts w:asciiTheme="minorHAnsi" w:eastAsiaTheme="minorHAnsi" w:hAnsiTheme="minorHAnsi" w:cstheme="minorBidi"/>
+          <w:kern w:val="2"/>
+          <w:sz w:val="24"/>
+          <w:szCs w:val="24"/>
+          <w:lang w:val="en-IN"/>
+          <w14:ligatures w14:val="standardContextual"/>
+        </w:rPr>
+        <w:t xml:space="preserve">63L, new </w:t>
+      </w:r>
+      <w:proofErr w:type="gramStart"/>
+      <w:r>
+        <w:rPr>
+          <w:rFonts w:asciiTheme="minorHAnsi" w:eastAsiaTheme="minorHAnsi" w:hAnsiTheme="minorHAnsi" w:cstheme="minorBidi"/>
+          <w:kern w:val="2"/>
+          <w:sz w:val="24"/>
+          <w:szCs w:val="24"/>
+          <w:lang w:val="en-IN"/>
+          <w14:ligatures w14:val="standardContextual"/>
+        </w:rPr>
+        <w:t>Student(</w:t>
+      </w:r>
+      <w:proofErr w:type="gramEnd"/>
+      <w:r>
+        <w:rPr>
+          <w:rFonts w:asciiTheme="minorHAnsi" w:eastAsiaTheme="minorHAnsi" w:hAnsiTheme="minorHAnsi" w:cstheme="minorBidi"/>
+          <w:kern w:val="2"/>
+          <w:sz w:val="24"/>
+          <w:szCs w:val="24"/>
+          <w:lang w:val="en-IN"/>
+          <w14:ligatures w14:val="standardContextual"/>
+        </w:rPr>
+        <w:t>63L, "Jane Smith"));</w:t>
+      </w:r>
+    </w:p>
+    <w:p>
+      <w:pPr>
+        <w:pStyle w:val="HTMLPreformatted"/>
+        <w:rPr>
+          <w:rFonts w:asciiTheme="minorHAnsi" w:eastAsiaTheme="minorHAnsi" w:hAnsiTheme="minorHAnsi" w:cstheme="minorBidi"/>
+          <w:kern w:val="2"/>
+          <w:sz w:val="24"/>
+          <w:szCs w:val="24"/>
+          <w:lang w:val="en-IN"/>
+          <w14:ligatures w14:val="standardContextual"/>
+        </w:rPr>
+      </w:pPr>
+      <w:r>
+        <w:rPr>
+          <w:rFonts w:asciiTheme="minorHAnsi" w:eastAsiaTheme="minorHAnsi" w:hAnsiTheme="minorHAnsi" w:cstheme="minorBidi"/>
+          <w:kern w:val="2"/>
+          <w:sz w:val="24"/>
+          <w:szCs w:val="24"/>
+          <w:lang w:val="en-IN"/>
+          <w14:ligatures w14:val="standardContextual"/>
+        </w:rPr>
+        <w:t xml:space="preserve">    }</w:t>
+      </w:r>
+    </w:p>
+    <w:p>
+      <w:pPr>
+        <w:pStyle w:val="HTMLPreformatted"/>
+        <w:rPr>
+          <w:rFonts w:asciiTheme="minorHAnsi" w:eastAsiaTheme="minorHAnsi" w:hAnsiTheme="minorHAnsi" w:cstheme="minorBidi"/>
+          <w:kern w:val="2"/>
+          <w:sz w:val="24"/>
+          <w:szCs w:val="24"/>
+          <w:lang w:val="en-IN"/>
+          <w14:ligatures w14:val="standardContextual"/>
+        </w:rPr>
+      </w:pPr>
+    </w:p>
+    <w:p>
+      <w:pPr>
+        <w:pStyle w:val="HTMLPreformatted"/>
+        <w:rPr>
+          <w:rFonts w:asciiTheme="minorHAnsi" w:eastAsiaTheme="minorHAnsi" w:hAnsiTheme="minorHAnsi" w:cstheme="minorBidi"/>
+          <w:kern w:val="2"/>
+          <w:sz w:val="24"/>
+          <w:szCs w:val="24"/>
+          <w:lang w:val="en-IN"/>
+          <w14:ligatures w14:val="standardContextual"/>
+        </w:rPr>
+      </w:pPr>
+      <w:r>
+        <w:rPr>
+          <w:rFonts w:asciiTheme="minorHAnsi" w:eastAsiaTheme="minorHAnsi" w:hAnsiTheme="minorHAnsi" w:cstheme="minorBidi"/>
+          <w:kern w:val="2"/>
+          <w:sz w:val="24"/>
+          <w:szCs w:val="24"/>
+          <w:lang w:val="en-IN"/>
+          <w14:ligatures w14:val="standardContextual"/>
+        </w:rPr>
+        <w:t xml:space="preserve">    @GetMapping("/{id}")</w:t>
+      </w:r>
+    </w:p>
+    <w:p>
+      <w:pPr>
+        <w:pStyle w:val="HTMLPreformatted"/>
+        <w:rPr>
+          <w:rFonts w:asciiTheme="minorHAnsi" w:eastAsiaTheme="minorHAnsi" w:hAnsiTheme="minorHAnsi" w:cstheme="minorBidi"/>
+          <w:kern w:val="2"/>
+          <w:sz w:val="24"/>
+          <w:szCs w:val="24"/>
+          <w:lang w:val="en-IN"/>
+          <w14:ligatures w14:val="standardContextual"/>
+        </w:rPr>
+      </w:pPr>
+      <w:r>
+        <w:rPr>
+          <w:rFonts w:asciiTheme="minorHAnsi" w:eastAsiaTheme="minorHAnsi" w:hAnsiTheme="minorHAnsi" w:cstheme="minorBidi"/>
+          <w:kern w:val="2"/>
+          <w:sz w:val="24"/>
+          <w:szCs w:val="24"/>
+          <w:lang w:val="en-IN"/>
+          <w14:ligatures w14:val="standardContextual"/>
+        </w:rPr>
+        <w:t xml:space="preserve">    public </w:t>
+      </w:r>
+      <w:proofErr w:type="spellStart"/>
+      <w:r>
+        <w:rPr>
+          <w:rFonts w:asciiTheme="minorHAnsi" w:eastAsiaTheme="minorHAnsi" w:hAnsiTheme="minorHAnsi" w:cstheme="minorBidi"/>
+          <w:kern w:val="2"/>
+          <w:sz w:val="24"/>
+          <w:szCs w:val="24"/>
+          <w:lang w:val="en-IN"/>
+          <w14:ligatures w14:val="standardContextual"/>
+        </w:rPr>
+        <w:t>ResponseEntity</w:t>
+      </w:r>
+      <w:proofErr w:type="spellEnd"/>
+      <w:r>
+        <w:rPr>
+          <w:rFonts w:asciiTheme="minorHAnsi" w:eastAsiaTheme="minorHAnsi" w:hAnsiTheme="minorHAnsi" w:cstheme="minorBidi"/>
+          <w:kern w:val="2"/>
+          <w:sz w:val="24"/>
+          <w:szCs w:val="24"/>
+          <w:lang w:val="en-IN"/>
+          <w14:ligatures w14:val="standardContextual"/>
+        </w:rPr>
+        <w:t xml:space="preserve">&lt;Student&gt; </w:t>
+      </w:r>
+      <w:proofErr w:type="spellStart"/>
+      <w:proofErr w:type="gramStart"/>
+      <w:r>
+        <w:rPr>
+          <w:rFonts w:asciiTheme="minorHAnsi" w:eastAsiaTheme="minorHAnsi" w:hAnsiTheme="minorHAnsi" w:cstheme="minorBidi"/>
+          <w:kern w:val="2"/>
+          <w:sz w:val="24"/>
+          <w:szCs w:val="24"/>
+          <w:lang w:val="en-IN"/>
+          <w14:ligatures w14:val="standardContextual"/>
+        </w:rPr>
+        <w:t>getStudent</w:t>
+      </w:r>
+      <w:proofErr w:type="spellEnd"/>
+      <w:r>
+        <w:rPr>
+          <w:rFonts w:asciiTheme="minorHAnsi" w:eastAsiaTheme="minorHAnsi" w:hAnsiTheme="minorHAnsi" w:cstheme="minorBidi"/>
+          <w:kern w:val="2"/>
+          <w:sz w:val="24"/>
+          <w:szCs w:val="24"/>
+          <w:lang w:val="en-IN"/>
+          <w14:ligatures w14:val="standardContextual"/>
+        </w:rPr>
+        <w:t>(</w:t>
+      </w:r>
+      <w:proofErr w:type="gramEnd"/>
+      <w:r>
+        <w:rPr>
+          <w:rFonts w:asciiTheme="minorHAnsi" w:eastAsiaTheme="minorHAnsi" w:hAnsiTheme="minorHAnsi" w:cstheme="minorBidi"/>
+          <w:kern w:val="2"/>
+          <w:sz w:val="24"/>
+          <w:szCs w:val="24"/>
+          <w:lang w:val="en-IN"/>
+          <w14:ligatures w14:val="standardContextual"/>
+        </w:rPr>
+        <w:t>@PathVariable Long id) {</w:t>
+      </w:r>
+    </w:p>
+    <w:p>
+      <w:pPr>
+        <w:pStyle w:val="HTMLPreformatted"/>
+        <w:rPr>
+          <w:rFonts w:asciiTheme="minorHAnsi" w:eastAsiaTheme="minorHAnsi" w:hAnsiTheme="minorHAnsi" w:cstheme="minorBidi"/>
+          <w:kern w:val="2"/>
+          <w:sz w:val="24"/>
+          <w:szCs w:val="24"/>
+          <w:lang w:val="en-IN"/>
+          <w14:ligatures w14:val="standardContextual"/>
+        </w:rPr>
+      </w:pPr>
+      <w:r>
+        <w:rPr>
+          <w:rFonts w:asciiTheme="minorHAnsi" w:eastAsiaTheme="minorHAnsi" w:hAnsiTheme="minorHAnsi" w:cstheme="minorBidi"/>
+          <w:kern w:val="2"/>
+          <w:sz w:val="24"/>
+          <w:szCs w:val="24"/>
+          <w:lang w:val="en-IN"/>
+          <w14:ligatures w14:val="standardContextual"/>
+        </w:rPr>
+        <w:t xml:space="preserve">        Student s = </w:t>
+      </w:r>
+      <w:proofErr w:type="spellStart"/>
+      <w:r>
+        <w:rPr>
+          <w:rFonts w:asciiTheme="minorHAnsi" w:eastAsiaTheme="minorHAnsi" w:hAnsiTheme="minorHAnsi" w:cstheme="minorBidi"/>
+          <w:kern w:val="2"/>
+          <w:sz w:val="24"/>
+          <w:szCs w:val="24"/>
+          <w:lang w:val="en-IN"/>
+          <w14:ligatures w14:val="standardContextual"/>
+        </w:rPr>
+        <w:t>studentMap.get</w:t>
+      </w:r>
+      <w:proofErr w:type="spellEnd"/>
+      <w:r>
+        <w:rPr>
+          <w:rFonts w:asciiTheme="minorHAnsi" w:eastAsiaTheme="minorHAnsi" w:hAnsiTheme="minorHAnsi" w:cstheme="minorBidi"/>
+          <w:kern w:val="2"/>
+          <w:sz w:val="24"/>
+          <w:szCs w:val="24"/>
+          <w:lang w:val="en-IN"/>
+          <w14:ligatures w14:val="standardContextual"/>
+        </w:rPr>
+        <w:t>(id);</w:t>
+      </w:r>
+    </w:p>
+    <w:p>
+      <w:pPr>
+        <w:pStyle w:val="HTMLPreformatted"/>
+        <w:rPr>
+          <w:rFonts w:asciiTheme="minorHAnsi" w:eastAsiaTheme="minorHAnsi" w:hAnsiTheme="minorHAnsi" w:cstheme="minorBidi"/>
+          <w:kern w:val="2"/>
+          <w:sz w:val="24"/>
+          <w:szCs w:val="24"/>
+          <w:lang w:val="en-IN"/>
+          <w14:ligatures w14:val="standardContextual"/>
+        </w:rPr>
+      </w:pPr>
+      <w:r>
+        <w:rPr>
+          <w:rFonts w:asciiTheme="minorHAnsi" w:eastAsiaTheme="minorHAnsi" w:hAnsiTheme="minorHAnsi" w:cstheme="minorBidi"/>
+          <w:kern w:val="2"/>
+          <w:sz w:val="24"/>
+          <w:szCs w:val="24"/>
+          <w:lang w:val="en-IN"/>
+          <w14:ligatures w14:val="standardContextual"/>
+        </w:rPr>
+        <w:t xml:space="preserve">        return (</w:t>
+      </w:r>
+      <w:proofErr w:type="gramStart"/>
+      <w:r>
+        <w:rPr>
+          <w:rFonts w:asciiTheme="minorHAnsi" w:eastAsiaTheme="minorHAnsi" w:hAnsiTheme="minorHAnsi" w:cstheme="minorBidi"/>
+          <w:kern w:val="2"/>
+          <w:sz w:val="24"/>
+          <w:szCs w:val="24"/>
+          <w:lang w:val="en-IN"/>
+          <w14:ligatures w14:val="standardContextual"/>
+        </w:rPr>
+        <w:t>s !</w:t>
+      </w:r>
+      <w:proofErr w:type="gramEnd"/>
+      <w:r>
+        <w:rPr>
+          <w:rFonts w:asciiTheme="minorHAnsi" w:eastAsiaTheme="minorHAnsi" w:hAnsiTheme="minorHAnsi" w:cstheme="minorBidi"/>
+          <w:kern w:val="2"/>
+          <w:sz w:val="24"/>
+          <w:szCs w:val="24"/>
+          <w:lang w:val="en-IN"/>
+          <w14:ligatures w14:val="standardContextual"/>
+        </w:rPr>
+        <w:t>= null</w:t>
+      </w:r>
+      <w:proofErr w:type="gramStart"/>
+      <w:r>
+        <w:rPr>
+          <w:rFonts w:asciiTheme="minorHAnsi" w:eastAsiaTheme="minorHAnsi" w:hAnsiTheme="minorHAnsi" w:cstheme="minorBidi"/>
+          <w:kern w:val="2"/>
+          <w:sz w:val="24"/>
+          <w:szCs w:val="24"/>
+          <w:lang w:val="en-IN"/>
+          <w14:ligatures w14:val="standardContextual"/>
+        </w:rPr>
+        <w:t>) ?</w:t>
+      </w:r>
+      <w:proofErr w:type="gramEnd"/>
+      <w:r>
+        <w:rPr>
+          <w:rFonts w:asciiTheme="minorHAnsi" w:eastAsiaTheme="minorHAnsi" w:hAnsiTheme="minorHAnsi" w:cstheme="minorBidi"/>
+          <w:kern w:val="2"/>
+          <w:sz w:val="24"/>
+          <w:szCs w:val="24"/>
+          <w:lang w:val="en-IN"/>
+          <w14:ligatures w14:val="standardContextual"/>
+        </w:rPr>
+        <w:t xml:space="preserve"> </w:t>
+      </w:r>
+      <w:proofErr w:type="spellStart"/>
+      <w:r>
+        <w:rPr>
+          <w:rFonts w:asciiTheme="minorHAnsi" w:eastAsiaTheme="minorHAnsi" w:hAnsiTheme="minorHAnsi" w:cstheme="minorBidi"/>
+          <w:kern w:val="2"/>
+          <w:sz w:val="24"/>
+          <w:szCs w:val="24"/>
+          <w:lang w:val="en-IN"/>
+          <w14:ligatures w14:val="standardContextual"/>
+        </w:rPr>
+        <w:t>ResponseEntity.ok</w:t>
+      </w:r>
+      <w:proofErr w:type="spellEnd"/>
+      <w:r>
+        <w:rPr>
+          <w:rFonts w:asciiTheme="minorHAnsi" w:eastAsiaTheme="minorHAnsi" w:hAnsiTheme="minorHAnsi" w:cstheme="minorBidi"/>
+          <w:kern w:val="2"/>
+          <w:sz w:val="24"/>
+          <w:szCs w:val="24"/>
+          <w:lang w:val="en-IN"/>
+          <w14:ligatures w14:val="standardContextual"/>
+        </w:rPr>
+        <w:t>(s</w:t>
+      </w:r>
+      <w:proofErr w:type="gramStart"/>
+      <w:r>
+        <w:rPr>
+          <w:rFonts w:asciiTheme="minorHAnsi" w:eastAsiaTheme="minorHAnsi" w:hAnsiTheme="minorHAnsi" w:cstheme="minorBidi"/>
+          <w:kern w:val="2"/>
+          <w:sz w:val="24"/>
+          <w:szCs w:val="24"/>
+          <w:lang w:val="en-IN"/>
+          <w14:ligatures w14:val="standardContextual"/>
+        </w:rPr>
+        <w:t>) :</w:t>
+      </w:r>
+      <w:proofErr w:type="gramEnd"/>
+      <w:r>
+        <w:rPr>
+          <w:rFonts w:asciiTheme="minorHAnsi" w:eastAsiaTheme="minorHAnsi" w:hAnsiTheme="minorHAnsi" w:cstheme="minorBidi"/>
+          <w:kern w:val="2"/>
+          <w:sz w:val="24"/>
+          <w:szCs w:val="24"/>
+          <w:lang w:val="en-IN"/>
+          <w14:ligatures w14:val="standardContextual"/>
+        </w:rPr>
+        <w:t xml:space="preserve"> </w:t>
+      </w:r>
+      <w:proofErr w:type="spellStart"/>
+      <w:r>
+        <w:rPr>
+          <w:rFonts w:asciiTheme="minorHAnsi" w:eastAsiaTheme="minorHAnsi" w:hAnsiTheme="minorHAnsi" w:cstheme="minorBidi"/>
+          <w:kern w:val="2"/>
+          <w:sz w:val="24"/>
+          <w:szCs w:val="24"/>
+          <w:lang w:val="en-IN"/>
+          <w14:ligatures w14:val="standardContextual"/>
+        </w:rPr>
+        <w:t>ResponseEntity.notFound</w:t>
+      </w:r>
+      <w:proofErr w:type="spellEnd"/>
+      <w:r>
+        <w:rPr>
+          <w:rFonts w:asciiTheme="minorHAnsi" w:eastAsiaTheme="minorHAnsi" w:hAnsiTheme="minorHAnsi" w:cstheme="minorBidi"/>
+          <w:kern w:val="2"/>
+          <w:sz w:val="24"/>
+          <w:szCs w:val="24"/>
+          <w:lang w:val="en-IN"/>
+          <w14:ligatures w14:val="standardContextual"/>
+        </w:rPr>
+        <w:t>(</w:t>
+      </w:r>
+      <w:proofErr w:type="gramStart"/>
+      <w:r>
+        <w:rPr>
+          <w:rFonts w:asciiTheme="minorHAnsi" w:eastAsiaTheme="minorHAnsi" w:hAnsiTheme="minorHAnsi" w:cstheme="minorBidi"/>
+          <w:kern w:val="2"/>
+          <w:sz w:val="24"/>
+          <w:szCs w:val="24"/>
+          <w:lang w:val="en-IN"/>
+          <w14:ligatures w14:val="standardContextual"/>
+        </w:rPr>
+        <w:t>).build</w:t>
+      </w:r>
+      <w:proofErr w:type="gramEnd"/>
+      <w:r>
+        <w:rPr>
+          <w:rFonts w:asciiTheme="minorHAnsi" w:eastAsiaTheme="minorHAnsi" w:hAnsiTheme="minorHAnsi" w:cstheme="minorBidi"/>
+          <w:kern w:val="2"/>
+          <w:sz w:val="24"/>
+          <w:szCs w:val="24"/>
+          <w:lang w:val="en-IN"/>
+          <w14:ligatures w14:val="standardContextual"/>
+        </w:rPr>
+        <w:t>();</w:t>
+      </w:r>
+    </w:p>
+    <w:p>
+      <w:pPr>
+        <w:pStyle w:val="HTMLPreformatted"/>
+        <w:rPr>
+          <w:rFonts w:asciiTheme="minorHAnsi" w:eastAsiaTheme="minorHAnsi" w:hAnsiTheme="minorHAnsi" w:cstheme="minorBidi"/>
+          <w:kern w:val="2"/>
+          <w:sz w:val="24"/>
+          <w:szCs w:val="24"/>
+          <w:lang w:val="en-IN"/>
+          <w14:ligatures w14:val="standardContextual"/>
+        </w:rPr>
+      </w:pPr>
+      <w:r>
+        <w:rPr>
+          <w:rFonts w:asciiTheme="minorHAnsi" w:eastAsiaTheme="minorHAnsi" w:hAnsiTheme="minorHAnsi" w:cstheme="minorBidi"/>
+          <w:kern w:val="2"/>
+          <w:sz w:val="24"/>
+          <w:szCs w:val="24"/>
+          <w:lang w:val="en-IN"/>
+          <w14:ligatures w14:val="standardContextual"/>
+        </w:rPr>
+        <w:t xml:space="preserve">    }</w:t>
+      </w:r>
+    </w:p>
+    <w:p>
+      <w:pPr>
+        <w:pStyle w:val="HTMLPreformatted"/>
+        <w:rPr>
+          <w:rFonts w:asciiTheme="minorHAnsi" w:eastAsiaTheme="minorHAnsi" w:hAnsiTheme="minorHAnsi" w:cstheme="minorBidi"/>
+          <w:kern w:val="2"/>
+          <w:sz w:val="24"/>
+          <w:szCs w:val="24"/>
+          <w:lang w:val="en-IN"/>
+          <w14:ligatures w14:val="standardContextual"/>
+        </w:rPr>
+      </w:pPr>
+      <w:r>
+        <w:rPr>
+          <w:rFonts w:asciiTheme="minorHAnsi" w:eastAsiaTheme="minorHAnsi" w:hAnsiTheme="minorHAnsi" w:cstheme="minorBidi"/>
+          <w:kern w:val="2"/>
+          <w:sz w:val="24"/>
+          <w:szCs w:val="24"/>
+          <w:lang w:val="en-IN"/>
+          <w14:ligatures w14:val="standardContextual"/>
+        </w:rPr>
+        <w:t>}</w:t>
+      </w:r>
+    </w:p>
+    <w:p>
+      <w:pPr>
+        <w:rPr>
+          <w:lang w:val="en-US"/>
+        </w:rPr>
+      </w:pPr>
     </w:p>
     <w:sectPr>
       <w:pgSz w:w="11906" w:h="16838"/>
@@ -4807,6 +6161,113 @@
       <w:spacing w:val="5"/>
     </w:rPr>
   </w:style>
+  <w:style w:type="paragraph" w:styleId="HTMLPreformatted">
+    <w:name w:val="HTML Preformatted"/>
+    <w:basedOn w:val="Normal"/>
+    <w:link w:val="HTMLPreformattedChar"/>
+    <w:uiPriority w:val="99"/>
+    <w:semiHidden/>
+    <w:unhideWhenUsed/>
+    <w:rsid w:val="00BC080F"/>
+    <w:pPr>
+      <w:tabs>
+        <w:tab w:val="left" w:pos="916"/>
+        <w:tab w:val="left" w:pos="1832"/>
+        <w:tab w:val="left" w:pos="2748"/>
+        <w:tab w:val="left" w:pos="3664"/>
+        <w:tab w:val="left" w:pos="4580"/>
+        <w:tab w:val="left" w:pos="5496"/>
+        <w:tab w:val="left" w:pos="6412"/>
+        <w:tab w:val="left" w:pos="7328"/>
+        <w:tab w:val="left" w:pos="8244"/>
+        <w:tab w:val="left" w:pos="9160"/>
+        <w:tab w:val="left" w:pos="10076"/>
+        <w:tab w:val="left" w:pos="10992"/>
+        <w:tab w:val="left" w:pos="11908"/>
+        <w:tab w:val="left" w:pos="12824"/>
+        <w:tab w:val="left" w:pos="13740"/>
+        <w:tab w:val="left" w:pos="14656"/>
+      </w:tabs>
+      <w:spacing w:after="0" w:line="240" w:lineRule="auto"/>
+    </w:pPr>
+    <w:rPr>
+      <w:rFonts w:ascii="Courier New" w:eastAsia="Times New Roman" w:hAnsi="Courier New" w:cs="Courier New"/>
+      <w:kern w:val="0"/>
+      <w:sz w:val="20"/>
+      <w:szCs w:val="20"/>
+      <w:lang w:val="en-US"/>
+      <w14:ligatures w14:val="none"/>
+    </w:rPr>
+  </w:style>
+  <w:style w:type="character" w:customStyle="1" w:styleId="HTMLPreformattedChar">
+    <w:name w:val="HTML Preformatted Char"/>
+    <w:basedOn w:val="DefaultParagraphFont"/>
+    <w:link w:val="HTMLPreformatted"/>
+    <w:uiPriority w:val="99"/>
+    <w:semiHidden/>
+    <w:rsid w:val="00BC080F"/>
+    <w:rPr>
+      <w:rFonts w:ascii="Courier New" w:eastAsia="Times New Roman" w:hAnsi="Courier New" w:cs="Courier New"/>
+      <w:kern w:val="0"/>
+      <w:sz w:val="20"/>
+      <w:szCs w:val="20"/>
+      <w:lang w:val="en-US"/>
+      <w14:ligatures w14:val="none"/>
+    </w:rPr>
+  </w:style>
+  <w:style w:type="character" w:styleId="HTMLCode">
+    <w:name w:val="HTML Code"/>
+    <w:basedOn w:val="DefaultParagraphFont"/>
+    <w:uiPriority w:val="99"/>
+    <w:semiHidden/>
+    <w:unhideWhenUsed/>
+    <w:rsid w:val="00BC080F"/>
+    <w:rPr>
+      <w:rFonts w:ascii="Courier New" w:eastAsia="Times New Roman" w:hAnsi="Courier New" w:cs="Courier New"/>
+      <w:sz w:val="20"/>
+      <w:szCs w:val="20"/>
+    </w:rPr>
+  </w:style>
+  <w:style w:type="character" w:customStyle="1" w:styleId="hljs-meta">
+    <w:name w:val="hljs-meta"/>
+    <w:basedOn w:val="DefaultParagraphFont"/>
+    <w:rsid w:val="00BC080F"/>
+  </w:style>
+  <w:style w:type="character" w:customStyle="1" w:styleId="hljs-keyword">
+    <w:name w:val="hljs-keyword"/>
+    <w:basedOn w:val="DefaultParagraphFont"/>
+    <w:rsid w:val="00BC080F"/>
+  </w:style>
+  <w:style w:type="character" w:customStyle="1" w:styleId="hljs-class">
+    <w:name w:val="hljs-class"/>
+    <w:basedOn w:val="DefaultParagraphFont"/>
+    <w:rsid w:val="00BC080F"/>
+  </w:style>
+  <w:style w:type="character" w:customStyle="1" w:styleId="hljs-title">
+    <w:name w:val="hljs-title"/>
+    <w:basedOn w:val="DefaultParagraphFont"/>
+    <w:rsid w:val="00BC080F"/>
+  </w:style>
+  <w:style w:type="character" w:customStyle="1" w:styleId="hljs-function">
+    <w:name w:val="hljs-function"/>
+    <w:basedOn w:val="DefaultParagraphFont"/>
+    <w:rsid w:val="00BC080F"/>
+  </w:style>
+  <w:style w:type="character" w:customStyle="1" w:styleId="hljs-params">
+    <w:name w:val="hljs-params"/>
+    <w:basedOn w:val="DefaultParagraphFont"/>
+    <w:rsid w:val="00BC080F"/>
+  </w:style>
+  <w:style w:type="character" w:customStyle="1" w:styleId="hljs-string">
+    <w:name w:val="hljs-string"/>
+    <w:basedOn w:val="DefaultParagraphFont"/>
+    <w:rsid w:val="00BC080F"/>
+  </w:style>
+  <w:style w:type="character" w:customStyle="1" w:styleId="hljs-number">
+    <w:name w:val="hljs-number"/>
+    <w:basedOn w:val="DefaultParagraphFont"/>
+    <w:rsid w:val="00BC080F"/>
+  </w:style>
 </w:styles>
 </file>
 

</xml_diff>